<commit_message>
Finalize TAU2 LR1 report figures
</commit_message>
<xml_diff>
--- a/ТАУ/СЕМ7 ТАУ2/ЛР1/Отчет_ЛР1_Грудинин_Турханов_Огарков.docx
+++ b/ТАУ/СЕМ7 ТАУ2/ЛР1/Отчет_ЛР1_Грудинин_Турханов_Огарков.docx
@@ -1290,11 +1290,7 @@
         </w:rPr>
       </w:pPr>
       <w:r>
-        <w:rPr>
-          <w:rFonts w:ascii="Times New Roman" w:hAnsi="Times New Roman"/>
-          <w:color w:val="000000"/>
-        </w:rPr>
-        <w:t>На рисунке 2 приведены переходные характеристики НСАУ и ИСАУ при периодах квантования 0,015 и 0,6 с. Штриховыми линиями показаны границы пяти процентов от установившегося значения.</w:t>
+        <w:t>На рисунках 2 и 3 приведены переходные характеристики НСАУ и ИСАУ при периодах квантования 0,015 и 0,6 с. Штриховыми линиями показаны границы пяти процентов от установившегося значения.</w:t>
       </w:r>
     </w:p>
     <w:p>
@@ -1305,26 +1301,22 @@
         <w:jc w:val="center"/>
       </w:pPr>
       <w:r>
-        <w:rPr>
-          <w:noProof/>
-        </w:rPr>
         <w:drawing>
-          <wp:inline distT="0" distB="0" distL="0" distR="0" wp14:anchorId="204D6FFB" wp14:editId="55CDC048">
-            <wp:extent cx="5486400" cy="3017520"/>
-            <wp:effectExtent l="0" t="0" r="0" b="0"/>
-            <wp:docPr id="2" name="Picture 2"/>
+          <wp:inline xmlns:a="http://schemas.openxmlformats.org/drawingml/2006/main" xmlns:pic="http://schemas.openxmlformats.org/drawingml/2006/picture">
+            <wp:extent cx="5669280" cy="6236208"/>
+            <wp:docPr id="6" name="Picture 6"/>
             <wp:cNvGraphicFramePr>
-              <a:graphicFrameLocks xmlns:a="http://schemas.openxmlformats.org/drawingml/2006/main" noChangeAspect="1"/>
+              <a:graphicFrameLocks noChangeAspect="1"/>
             </wp:cNvGraphicFramePr>
-            <a:graphic xmlns:a="http://schemas.openxmlformats.org/drawingml/2006/main">
+            <a:graphic>
               <a:graphicData uri="http://schemas.openxmlformats.org/drawingml/2006/picture">
-                <pic:pic xmlns:pic="http://schemas.openxmlformats.org/drawingml/2006/picture">
+                <pic:pic>
                   <pic:nvPicPr>
-                    <pic:cNvPr id="0" name="transient_bw.png"/>
+                    <pic:cNvPr id="0" name="transient_panel_1.png"/>
                     <pic:cNvPicPr/>
                   </pic:nvPicPr>
                   <pic:blipFill>
-                    <a:blip r:embed="rId12"/>
+                    <a:blip r:embed="rId19"/>
                     <a:stretch>
                       <a:fillRect/>
                     </a:stretch>
@@ -1332,11 +1324,9 @@
                   <pic:spPr>
                     <a:xfrm>
                       <a:off x="0" y="0"/>
-                      <a:ext cx="5486400" cy="3017520"/>
+                      <a:ext cx="5669280" cy="6236208"/>
                     </a:xfrm>
-                    <a:prstGeom prst="rect">
-                      <a:avLst/>
-                    </a:prstGeom>
+                    <a:prstGeom prst="rect"/>
                   </pic:spPr>
                 </pic:pic>
               </a:graphicData>
@@ -1358,9 +1348,76 @@
       <w:r>
         <w:rPr>
           <w:rFonts w:ascii="Times New Roman" w:hAnsi="Times New Roman"/>
-          <w:color w:val="000000"/>
+          <w:b w:val="0"/>
+          <w:sz w:val="24"/>
         </w:rPr>
-        <w:t>Рисунок 2 — Переходные процессы при периодах квантования 0,015 и 0,6 с</w:t>
+        <w:t>Рисунок 2 — Переходные процессы при периоде квантования 0,015 с</w:t>
+      </w:r>
+    </w:p>
+    <w:p>
+      <w:pPr>
+        <w:keepNext/>
+        <w:keepLines/>
+        <w:pageBreakBefore/>
+        <w:spacing w:before="0" w:after="60"/>
+        <w:ind w:firstLine="0"/>
+        <w:jc w:val="center"/>
+        <w:rPr>
+          <w:lang w:val="ru-RU"/>
+        </w:rPr>
+      </w:pPr>
+      <w:r>
+        <w:drawing>
+          <wp:inline xmlns:a="http://schemas.openxmlformats.org/drawingml/2006/main" xmlns:pic="http://schemas.openxmlformats.org/drawingml/2006/picture">
+            <wp:extent cx="5669280" cy="6236208"/>
+            <wp:docPr id="7" name="Picture 7"/>
+            <wp:cNvGraphicFramePr>
+              <a:graphicFrameLocks noChangeAspect="1"/>
+            </wp:cNvGraphicFramePr>
+            <a:graphic>
+              <a:graphicData uri="http://schemas.openxmlformats.org/drawingml/2006/picture">
+                <pic:pic>
+                  <pic:nvPicPr>
+                    <pic:cNvPr id="0" name="transient_panel_2.png"/>
+                    <pic:cNvPicPr/>
+                  </pic:nvPicPr>
+                  <pic:blipFill>
+                    <a:blip r:embed="rId20"/>
+                    <a:stretch>
+                      <a:fillRect/>
+                    </a:stretch>
+                  </pic:blipFill>
+                  <pic:spPr>
+                    <a:xfrm>
+                      <a:off x="0" y="0"/>
+                      <a:ext cx="5669280" cy="6236208"/>
+                    </a:xfrm>
+                    <a:prstGeom prst="rect"/>
+                  </pic:spPr>
+                </pic:pic>
+              </a:graphicData>
+            </a:graphic>
+          </wp:inline>
+        </w:drawing>
+      </w:r>
+    </w:p>
+    <w:p>
+      <w:pPr>
+        <w:keepNext/>
+        <w:keepLines/>
+        <w:spacing w:before="0" w:after="100"/>
+        <w:ind w:firstLine="0"/>
+        <w:jc w:val="center"/>
+        <w:rPr>
+          <w:lang w:val="ru-RU"/>
+        </w:rPr>
+      </w:pPr>
+      <w:r>
+        <w:rPr>
+          <w:rFonts w:ascii="Times New Roman" w:hAnsi="Times New Roman"/>
+          <w:sz w:val="24"/>
+        </w:rPr>
+        <w:t>Рисунок 3 — Переходные процессы при периоде квантования 0,6 с</w:t>
       </w:r>
     </w:p>
     <w:p>
@@ -1993,26 +2050,22 @@
         <w:jc w:val="center"/>
       </w:pPr>
       <w:r>
-        <w:rPr>
-          <w:noProof/>
-        </w:rPr>
         <w:drawing>
-          <wp:inline distT="0" distB="0" distL="0" distR="0" wp14:anchorId="51566AAA" wp14:editId="7B46D3CC">
-            <wp:extent cx="5486400" cy="2926080"/>
-            <wp:effectExtent l="0" t="0" r="0" b="0"/>
-            <wp:docPr id="3" name="Picture 3"/>
+          <wp:inline xmlns:a="http://schemas.openxmlformats.org/drawingml/2006/main" xmlns:pic="http://schemas.openxmlformats.org/drawingml/2006/picture">
+            <wp:extent cx="5669280" cy="6047232"/>
+            <wp:docPr id="8" name="Picture 8"/>
             <wp:cNvGraphicFramePr>
-              <a:graphicFrameLocks xmlns:a="http://schemas.openxmlformats.org/drawingml/2006/main" noChangeAspect="1"/>
+              <a:graphicFrameLocks noChangeAspect="1"/>
             </wp:cNvGraphicFramePr>
-            <a:graphic xmlns:a="http://schemas.openxmlformats.org/drawingml/2006/main">
+            <a:graphic>
               <a:graphicData uri="http://schemas.openxmlformats.org/drawingml/2006/picture">
-                <pic:pic xmlns:pic="http://schemas.openxmlformats.org/drawingml/2006/picture">
+                <pic:pic>
                   <pic:nvPicPr>
-                    <pic:cNvPr id="0" name="errors_bw.png"/>
+                    <pic:cNvPr id="0" name="errors_panel_1.png"/>
                     <pic:cNvPicPr/>
                   </pic:nvPicPr>
                   <pic:blipFill>
-                    <a:blip r:embed="rId13"/>
+                    <a:blip r:embed="rId21"/>
                     <a:stretch>
                       <a:fillRect/>
                     </a:stretch>
@@ -2020,11 +2073,9 @@
                   <pic:spPr>
                     <a:xfrm>
                       <a:off x="0" y="0"/>
-                      <a:ext cx="5486400" cy="2926080"/>
+                      <a:ext cx="5669280" cy="6047232"/>
                     </a:xfrm>
-                    <a:prstGeom prst="rect">
-                      <a:avLst/>
-                    </a:prstGeom>
+                    <a:prstGeom prst="rect"/>
                   </pic:spPr>
                 </pic:pic>
               </a:graphicData>
@@ -2045,10 +2096,77 @@
       </w:pPr>
       <w:r>
         <w:rPr>
-          <w:sz w:val="22"/>
+          <w:rFonts w:ascii="Times New Roman" w:hAnsi="Times New Roman"/>
+          <w:b w:val="0"/>
+          <w:sz w:val="24"/>
+        </w:rPr>
+        <w:t>Рисунок 4 — Ошибка при единичном скачке</w:t>
+      </w:r>
+    </w:p>
+    <w:p>
+      <w:pPr>
+        <w:keepNext/>
+        <w:keepLines/>
+        <w:pageBreakBefore/>
+        <w:spacing w:before="0" w:after="60"/>
+        <w:ind w:firstLine="0"/>
+        <w:jc w:val="center"/>
+        <w:rPr>
           <w:lang w:val="ru-RU"/>
         </w:rPr>
-        <w:t>Рисунок 3 — Установление ошибок при скачке и линейном входе</w:t>
+      </w:pPr>
+      <w:r>
+        <w:drawing>
+          <wp:inline xmlns:a="http://schemas.openxmlformats.org/drawingml/2006/main" xmlns:pic="http://schemas.openxmlformats.org/drawingml/2006/picture">
+            <wp:extent cx="5669280" cy="6047232"/>
+            <wp:docPr id="9" name="Picture 9"/>
+            <wp:cNvGraphicFramePr>
+              <a:graphicFrameLocks noChangeAspect="1"/>
+            </wp:cNvGraphicFramePr>
+            <a:graphic>
+              <a:graphicData uri="http://schemas.openxmlformats.org/drawingml/2006/picture">
+                <pic:pic>
+                  <pic:nvPicPr>
+                    <pic:cNvPr id="0" name="errors_panel_2.png"/>
+                    <pic:cNvPicPr/>
+                  </pic:nvPicPr>
+                  <pic:blipFill>
+                    <a:blip r:embed="rId22"/>
+                    <a:stretch>
+                      <a:fillRect/>
+                    </a:stretch>
+                  </pic:blipFill>
+                  <pic:spPr>
+                    <a:xfrm>
+                      <a:off x="0" y="0"/>
+                      <a:ext cx="5669280" cy="6047232"/>
+                    </a:xfrm>
+                    <a:prstGeom prst="rect"/>
+                  </pic:spPr>
+                </pic:pic>
+              </a:graphicData>
+            </a:graphic>
+          </wp:inline>
+        </w:drawing>
+      </w:r>
+    </w:p>
+    <w:p>
+      <w:pPr>
+        <w:keepNext/>
+        <w:keepLines/>
+        <w:spacing w:before="0" w:after="100"/>
+        <w:ind w:firstLine="0"/>
+        <w:jc w:val="center"/>
+        <w:rPr>
+          <w:lang w:val="ru-RU"/>
+        </w:rPr>
+      </w:pPr>
+      <w:r>
+        <w:rPr>
+          <w:rFonts w:ascii="Times New Roman" w:hAnsi="Times New Roman"/>
+          <w:sz w:val="24"/>
+        </w:rPr>
+        <w:t>Рисунок 5 — Ошибка при линейном входе</w:t>
       </w:r>
     </w:p>
     <w:p>
@@ -2491,9 +2609,10 @@
       <w:r>
         <w:rPr>
           <w:rFonts w:ascii="Times New Roman" w:hAnsi="Times New Roman"/>
-          <w:color w:val="000000"/>
+          <w:b w:val="0"/>
+          <w:sz w:val="24"/>
         </w:rPr>
-        <w:t>Рисунок 4 — Модель определения границы устойчивости при постоянной времени 7,5 с</w:t>
+        <w:t>Рисунок 6 — Модель определения границы устойчивости при постоянной времени 7,5 с</w:t>
       </w:r>
     </w:p>
     <w:p>
@@ -2949,11 +3068,7 @@
         </w:rPr>
       </w:pPr>
       <w:r>
-        <w:rPr>
-          <w:rFonts w:ascii="Times New Roman" w:hAnsi="Times New Roman"/>
-          <w:color w:val="000000"/>
-        </w:rPr>
-        <w:t>Зависимость предельного коэффициента усиления от периода квантования и постоянной времени приведена в таблице 4 и на рисунке 5.</w:t>
+        <w:t>Зависимость предельного коэффициента усиления от периода квантования и постоянной времени приведена в таблице 4 и на рисунке 7.</w:t>
       </w:r>
     </w:p>
     <w:p>
@@ -3798,9 +3913,10 @@
       <w:r>
         <w:rPr>
           <w:rFonts w:ascii="Times New Roman" w:hAnsi="Times New Roman"/>
-          <w:color w:val="000000"/>
+          <w:b w:val="0"/>
+          <w:sz w:val="24"/>
         </w:rPr>
-        <w:t>Рисунок 5 — Зависимость предельного коэффициента усиления от постоянной времени при разных периодах квантования</w:t>
+        <w:t>Рисунок 7 — Зависимость предельного коэффициента усиления от постоянной времени при разных периодах квантования</w:t>
       </w:r>
     </w:p>
     <w:p>

</xml_diff>